<commit_message>
Update group contract template dates
</commit_message>
<xml_diff>
--- a/docs/assets/group-resources/group-contract-template.docx
+++ b/docs/assets/group-resources/group-contract-template.docx
@@ -682,21 +682,8 @@
             </w:pPr>
             <w:r>
               <w:rPr>
-                <w:rFonts w:ascii="Times New Roman" w:cs="Times New Roman" w:eastAsia="Times New Roman" w:hAnsi="Times New Roman"/>
-                <w:i w:val="1"/>
-                <w:iCs w:val="1"/>
                 <w:rtl w:val="0"/>
               </w:rPr>
-              <w:t xml:space="preserve">Write </w:t>
-            </w:r>
-            <w:r>
-              <w:rPr>
-                <w:rFonts w:ascii="Times New Roman" w:cs="Times New Roman" w:eastAsia="Times New Roman" w:hAnsi="Times New Roman"/>
-                <w:i w:val="1"/>
-                <w:iCs w:val="1"/>
-                <w:rtl w:val="0"/>
-              </w:rPr>
-              <w:t xml:space="preserve">Answer Here</w:t>
             </w:r>
           </w:p>
         </w:tc>
@@ -1183,12 +1170,8 @@
             </w:pPr>
             <w:r>
               <w:rPr>
-                <w:rFonts w:ascii="Times New Roman" w:cs="Times New Roman" w:eastAsia="Times New Roman" w:hAnsi="Times New Roman"/>
-                <w:i w:val="1"/>
-                <w:iCs w:val="1"/>
                 <w:rtl w:val="0"/>
               </w:rPr>
-              <w:t xml:space="preserve">Write Answer Here</w:t>
             </w:r>
           </w:p>
         </w:tc>
@@ -1410,12 +1393,8 @@
             </w:pPr>
             <w:r>
               <w:rPr>
-                <w:rFonts w:ascii="Times New Roman" w:cs="Times New Roman" w:eastAsia="Times New Roman" w:hAnsi="Times New Roman"/>
-                <w:i w:val="1"/>
-                <w:iCs w:val="1"/>
                 <w:rtl w:val="0"/>
               </w:rPr>
-              <w:t xml:space="preserve">Write Answer Here</w:t>
             </w:r>
           </w:p>
         </w:tc>
@@ -1545,12 +1524,8 @@
             </w:pPr>
             <w:r>
               <w:rPr>
-                <w:rFonts w:ascii="Times New Roman" w:cs="Times New Roman" w:eastAsia="Times New Roman" w:hAnsi="Times New Roman"/>
-                <w:i w:val="1"/>
-                <w:iCs w:val="1"/>
                 <w:rtl w:val="0"/>
               </w:rPr>
-              <w:t xml:space="preserve">Write Answer Here</w:t>
             </w:r>
           </w:p>
         </w:tc>
@@ -1701,12 +1676,8 @@
             </w:pPr>
             <w:r>
               <w:rPr>
-                <w:rFonts w:ascii="Times New Roman" w:cs="Times New Roman" w:eastAsia="Times New Roman" w:hAnsi="Times New Roman"/>
-                <w:i w:val="1"/>
-                <w:iCs w:val="1"/>
                 <w:rtl w:val="0"/>
               </w:rPr>
-              <w:t xml:space="preserve">Write Answer Here</w:t>
             </w:r>
           </w:p>
         </w:tc>
@@ -1966,12 +1937,8 @@
             </w:pPr>
             <w:r>
               <w:rPr>
-                <w:rFonts w:ascii="Times New Roman" w:cs="Times New Roman" w:eastAsia="Times New Roman" w:hAnsi="Times New Roman"/>
-                <w:i w:val="1"/>
-                <w:iCs w:val="1"/>
                 <w:rtl w:val="0"/>
               </w:rPr>
-              <w:t xml:space="preserve">Write Answer Here</w:t>
             </w:r>
           </w:p>
         </w:tc>
@@ -2075,12 +2042,8 @@
             </w:pPr>
             <w:r>
               <w:rPr>
-                <w:rFonts w:ascii="Times New Roman" w:cs="Times New Roman" w:eastAsia="Times New Roman" w:hAnsi="Times New Roman"/>
-                <w:i w:val="1"/>
-                <w:iCs w:val="1"/>
                 <w:rtl w:val="0"/>
               </w:rPr>
-              <w:t xml:space="preserve">Write Answer Here</w:t>
             </w:r>
           </w:p>
         </w:tc>
@@ -2196,12 +2159,8 @@
             </w:pPr>
             <w:r>
               <w:rPr>
-                <w:rFonts w:ascii="Times New Roman" w:cs="Times New Roman" w:eastAsia="Times New Roman" w:hAnsi="Times New Roman"/>
-                <w:i w:val="1"/>
-                <w:iCs w:val="1"/>
                 <w:rtl w:val="0"/>
               </w:rPr>
-              <w:t xml:space="preserve">Write Answer Here</w:t>
             </w:r>
           </w:p>
         </w:tc>
@@ -2384,15 +2343,6 @@
             </w:pPr>
             <w:r>
               <w:rPr>
-                <w:rFonts w:ascii="Times New Roman" w:cs="Times New Roman" w:eastAsia="Times New Roman" w:hAnsi="Times New Roman"/>
-                <w:i w:val="1"/>
-                <w:iCs w:val="1"/>
-                <w:rtl w:val="0"/>
-              </w:rPr>
-              <w:t xml:space="preserve">Write Answer Here</w:t>
-            </w:r>
-            <w:r>
-              <w:rPr>
                 <w:rtl w:val="0"/>
               </w:rPr>
             </w:r>
@@ -2498,12 +2448,8 @@
             </w:pPr>
             <w:r>
               <w:rPr>
-                <w:rFonts w:ascii="Times New Roman" w:cs="Times New Roman" w:eastAsia="Times New Roman" w:hAnsi="Times New Roman"/>
-                <w:i w:val="1"/>
-                <w:iCs w:val="1"/>
                 <w:rtl w:val="0"/>
               </w:rPr>
-              <w:t xml:space="preserve">Write Answer Here</w:t>
             </w:r>
           </w:p>
         </w:tc>
@@ -2716,12 +2662,8 @@
             </w:pPr>
             <w:r>
               <w:rPr>
-                <w:rFonts w:ascii="Times New Roman" w:cs="Times New Roman" w:eastAsia="Times New Roman" w:hAnsi="Times New Roman"/>
-                <w:i w:val="1"/>
-                <w:iCs w:val="1"/>
                 <w:rtl w:val="0"/>
               </w:rPr>
-              <w:t xml:space="preserve">Write Answer Here</w:t>
             </w:r>
           </w:p>
         </w:tc>
@@ -2827,15 +2769,6 @@
             </w:pPr>
             <w:r>
               <w:rPr>
-                <w:rFonts w:ascii="Times New Roman" w:cs="Times New Roman" w:eastAsia="Times New Roman" w:hAnsi="Times New Roman"/>
-                <w:i w:val="1"/>
-                <w:iCs w:val="1"/>
-                <w:rtl w:val="0"/>
-              </w:rPr>
-              <w:t xml:space="preserve">Write Answer Here</w:t>
-            </w:r>
-            <w:r>
-              <w:rPr>
                 <w:rtl w:val="0"/>
               </w:rPr>
             </w:r>
@@ -3037,12 +2970,8 @@
             </w:pPr>
             <w:r>
               <w:rPr>
-                <w:rFonts w:ascii="Times New Roman" w:cs="Times New Roman" w:eastAsia="Times New Roman" w:hAnsi="Times New Roman"/>
-                <w:i w:val="1"/>
-                <w:iCs w:val="1"/>
                 <w:rtl w:val="0"/>
               </w:rPr>
-              <w:t xml:space="preserve">Write Answer Here</w:t>
             </w:r>
           </w:p>
         </w:tc>
@@ -3136,15 +3065,6 @@
             </w:pPr>
             <w:r>
               <w:rPr>
-                <w:rFonts w:ascii="Times New Roman" w:cs="Times New Roman" w:eastAsia="Times New Roman" w:hAnsi="Times New Roman"/>
-                <w:i w:val="1"/>
-                <w:iCs w:val="1"/>
-                <w:rtl w:val="0"/>
-              </w:rPr>
-              <w:t xml:space="preserve">Write Answer Here</w:t>
-            </w:r>
-            <w:r>
-              <w:rPr>
                 <w:rtl w:val="0"/>
               </w:rPr>
             </w:r>
@@ -3367,12 +3287,8 @@
             </w:pPr>
             <w:r>
               <w:rPr>
-                <w:rFonts w:ascii="Times New Roman" w:cs="Times New Roman" w:eastAsia="Times New Roman" w:hAnsi="Times New Roman"/>
-                <w:i w:val="1"/>
-                <w:iCs w:val="1"/>
                 <w:rtl w:val="0"/>
               </w:rPr>
-              <w:t xml:space="preserve">Write Answer Here</w:t>
             </w:r>
           </w:p>
         </w:tc>
@@ -3499,12 +3415,8 @@
             </w:pPr>
             <w:r>
               <w:rPr>
-                <w:rFonts w:ascii="Times New Roman" w:cs="Times New Roman" w:eastAsia="Times New Roman" w:hAnsi="Times New Roman"/>
-                <w:i w:val="1"/>
-                <w:iCs w:val="1"/>
                 <w:rtl w:val="0"/>
               </w:rPr>
-              <w:t xml:space="preserve">Write Answer Here</w:t>
             </w:r>
           </w:p>
         </w:tc>
@@ -3668,12 +3580,8 @@
             </w:pPr>
             <w:r>
               <w:rPr>
-                <w:rFonts w:ascii="Times New Roman" w:cs="Times New Roman" w:eastAsia="Times New Roman" w:hAnsi="Times New Roman"/>
-                <w:i w:val="1"/>
-                <w:iCs w:val="1"/>
                 <w:rtl w:val="0"/>
               </w:rPr>
-              <w:t xml:space="preserve">Write Answer Here</w:t>
             </w:r>
           </w:p>
         </w:tc>
@@ -3788,12 +3696,8 @@
             </w:pPr>
             <w:r>
               <w:rPr>
-                <w:rFonts w:ascii="Times New Roman" w:cs="Times New Roman" w:eastAsia="Times New Roman" w:hAnsi="Times New Roman"/>
-                <w:i w:val="1"/>
-                <w:iCs w:val="1"/>
                 <w:rtl w:val="0"/>
               </w:rPr>
-              <w:t xml:space="preserve">Write Answer Here</w:t>
             </w:r>
           </w:p>
         </w:tc>
@@ -3908,12 +3812,8 @@
             </w:pPr>
             <w:r>
               <w:rPr>
-                <w:rFonts w:ascii="Times New Roman" w:cs="Times New Roman" w:eastAsia="Times New Roman" w:hAnsi="Times New Roman"/>
-                <w:i w:val="1"/>
-                <w:iCs w:val="1"/>
                 <w:rtl w:val="0"/>
               </w:rPr>
-              <w:t xml:space="preserve">Write Answer Here</w:t>
             </w:r>
           </w:p>
         </w:tc>
@@ -4034,15 +3934,6 @@
             </w:pPr>
             <w:r>
               <w:rPr>
-                <w:rFonts w:ascii="Times New Roman" w:cs="Times New Roman" w:eastAsia="Times New Roman" w:hAnsi="Times New Roman"/>
-                <w:i w:val="1"/>
-                <w:iCs w:val="1"/>
-                <w:rtl w:val="0"/>
-              </w:rPr>
-              <w:t xml:space="preserve">Write Answer Here</w:t>
-            </w:r>
-            <w:r>
-              <w:rPr>
                 <w:rtl w:val="0"/>
               </w:rPr>
             </w:r>
@@ -4231,12 +4122,8 @@
             </w:pPr>
             <w:r>
               <w:rPr>
-                <w:rFonts w:ascii="Times New Roman" w:cs="Times New Roman" w:eastAsia="Times New Roman" w:hAnsi="Times New Roman"/>
-                <w:i w:val="1"/>
-                <w:iCs w:val="1"/>
                 <w:rtl w:val="0"/>
               </w:rPr>
-              <w:t xml:space="preserve">Write Answer Here</w:t>
             </w:r>
           </w:p>
         </w:tc>
@@ -4351,12 +4238,8 @@
             </w:pPr>
             <w:r>
               <w:rPr>
-                <w:rFonts w:ascii="Times New Roman" w:cs="Times New Roman" w:eastAsia="Times New Roman" w:hAnsi="Times New Roman"/>
-                <w:i w:val="1"/>
-                <w:iCs w:val="1"/>
                 <w:rtl w:val="0"/>
               </w:rPr>
-              <w:t xml:space="preserve">Write Answer Here</w:t>
             </w:r>
           </w:p>
         </w:tc>
@@ -4486,12 +4369,8 @@
             </w:pPr>
             <w:r>
               <w:rPr>
-                <w:rFonts w:ascii="Times New Roman" w:cs="Times New Roman" w:eastAsia="Times New Roman" w:hAnsi="Times New Roman"/>
-                <w:i w:val="1"/>
-                <w:iCs w:val="1"/>
                 <w:rtl w:val="0"/>
               </w:rPr>
-              <w:t xml:space="preserve">Write Answer Here</w:t>
             </w:r>
           </w:p>
         </w:tc>
@@ -4606,12 +4485,8 @@
             </w:pPr>
             <w:r>
               <w:rPr>
-                <w:rFonts w:ascii="Times New Roman" w:cs="Times New Roman" w:eastAsia="Times New Roman" w:hAnsi="Times New Roman"/>
-                <w:i w:val="1"/>
-                <w:iCs w:val="1"/>
                 <w:rtl w:val="0"/>
               </w:rPr>
-              <w:t xml:space="preserve">Write Answer Here</w:t>
             </w:r>
           </w:p>
         </w:tc>
@@ -4705,15 +4580,6 @@
             </w:pPr>
             <w:r>
               <w:rPr>
-                <w:rFonts w:ascii="Times New Roman" w:cs="Times New Roman" w:eastAsia="Times New Roman" w:hAnsi="Times New Roman"/>
-                <w:i w:val="1"/>
-                <w:iCs w:val="1"/>
-                <w:rtl w:val="0"/>
-              </w:rPr>
-              <w:t xml:space="preserve">Write Answer Here</w:t>
-            </w:r>
-            <w:r>
-              <w:rPr>
                 <w:rtl w:val="0"/>
               </w:rPr>
             </w:r>
@@ -4945,12 +4811,8 @@
             </w:pPr>
             <w:r>
               <w:rPr>
-                <w:rFonts w:ascii="Times New Roman" w:cs="Times New Roman" w:eastAsia="Times New Roman" w:hAnsi="Times New Roman"/>
-                <w:i w:val="1"/>
-                <w:iCs w:val="1"/>
                 <w:rtl w:val="0"/>
               </w:rPr>
-              <w:t xml:space="preserve">Write Answer Here</w:t>
             </w:r>
           </w:p>
         </w:tc>
@@ -5065,12 +4927,8 @@
             </w:pPr>
             <w:r>
               <w:rPr>
-                <w:rFonts w:ascii="Times New Roman" w:cs="Times New Roman" w:eastAsia="Times New Roman" w:hAnsi="Times New Roman"/>
-                <w:i w:val="1"/>
-                <w:iCs w:val="1"/>
                 <w:rtl w:val="0"/>
               </w:rPr>
-              <w:t xml:space="preserve">Write Answer Here</w:t>
             </w:r>
           </w:p>
         </w:tc>
@@ -5162,15 +5020,6 @@
             <w:pPr>
               <w:rPr/>
             </w:pPr>
-            <w:r>
-              <w:rPr>
-                <w:rFonts w:ascii="Times New Roman" w:cs="Times New Roman" w:eastAsia="Times New Roman" w:hAnsi="Times New Roman"/>
-                <w:i w:val="1"/>
-                <w:iCs w:val="1"/>
-                <w:rtl w:val="0"/>
-              </w:rPr>
-              <w:t xml:space="preserve">Write Answer Here</w:t>
-            </w:r>
             <w:r>
               <w:rPr>
                 <w:rtl w:val="0"/>
@@ -5386,7 +5235,7 @@
           <w:rFonts w:ascii="Times New Roman" w:cs="Times New Roman" w:eastAsia="Times New Roman" w:hAnsi="Times New Roman"/>
           <w:rtl w:val="0"/>
         </w:rPr>
-        <w:t xml:space="preserve"> (Scheduled for June 19): </w:t>
+        <w:t xml:space="preserve"> (Scheduled for Oct 29): </w:t>
       </w:r>
       <w:r>
         <w:rPr>
@@ -5417,7 +5266,7 @@
           <w:rFonts w:ascii="Times New Roman" w:cs="Times New Roman" w:eastAsia="Times New Roman" w:hAnsi="Times New Roman"/>
           <w:rtl w:val="0"/>
         </w:rPr>
-        <w:t xml:space="preserve"> (Scheduled for August 11): </w:t>
+        <w:t xml:space="preserve"> (Scheduled for Dec 3): </w:t>
       </w:r>
     </w:p>
     <w:p>
@@ -5488,12 +5337,8 @@
             </w:pPr>
             <w:r>
               <w:rPr>
-                <w:rFonts w:ascii="Times New Roman" w:cs="Times New Roman" w:eastAsia="Times New Roman" w:hAnsi="Times New Roman"/>
-                <w:i w:val="1"/>
-                <w:iCs w:val="1"/>
                 <w:rtl w:val="0"/>
               </w:rPr>
-              <w:t xml:space="preserve">Write Answer Here</w:t>
             </w:r>
           </w:p>
         </w:tc>
@@ -5622,12 +5467,8 @@
             </w:pPr>
             <w:r>
               <w:rPr>
-                <w:rFonts w:ascii="Times New Roman" w:cs="Times New Roman" w:eastAsia="Times New Roman" w:hAnsi="Times New Roman"/>
-                <w:i w:val="1"/>
-                <w:iCs w:val="1"/>
                 <w:rtl w:val="0"/>
               </w:rPr>
-              <w:t xml:space="preserve">Write Answer Here</w:t>
             </w:r>
           </w:p>
         </w:tc>
@@ -5751,15 +5592,6 @@
             <w:pPr>
               <w:rPr/>
             </w:pPr>
-            <w:r>
-              <w:rPr>
-                <w:rFonts w:ascii="Times New Roman" w:cs="Times New Roman" w:eastAsia="Times New Roman" w:hAnsi="Times New Roman"/>
-                <w:i w:val="1"/>
-                <w:iCs w:val="1"/>
-                <w:rtl w:val="0"/>
-              </w:rPr>
-              <w:t xml:space="preserve">Write Answer Here</w:t>
-            </w:r>
             <w:r>
               <w:rPr>
                 <w:rtl w:val="0"/>
@@ -6037,6 +5869,7 @@
       <w:tr>
         <w:trPr>
           <w:cantSplit w:val="0"/>
+          <w:trHeight w:val="776.953125" w:hRule="atLeast"/>
           <w:tblHeader w:val="0"/>
         </w:trPr>
         <w:tc>
@@ -6172,7 +6005,7 @@
               </w:rPr>
               <w:t xml:space="preserve">Date </w:t>
               <w:br w:type="textWrapping"/>
-              <w:t xml:space="preserve">(May X, 2026)</w:t>
+              <w:t xml:space="preserve">(Sept X, 2026)</w:t>
             </w:r>
           </w:p>
         </w:tc>

</xml_diff>